<commit_message>
Updating report and frontsheet
</commit_message>
<xml_diff>
--- a/reports/HDS_ML_MZENDAH_1806_frontsheet.docx
+++ b/reports/HDS_ML_MZENDAH_1806_frontsheet.docx
@@ -210,7 +210,7 @@
               <w:pStyle w:val="Compact"/>
             </w:pPr>
             <w:r>
-              <w:t xml:space="preserve">3,852</w:t>
+              <w:t xml:space="preserve">3,331</w:t>
             </w:r>
           </w:p>
         </w:tc>
@@ -234,7 +234,7 @@
               <w:pStyle w:val="Compact"/>
             </w:pPr>
             <w:r>
-              <w:t xml:space="preserve">2,996</w:t>
+              <w:t xml:space="preserve">2,989</w:t>
             </w:r>
           </w:p>
         </w:tc>

</xml_diff>